<commit_message>
feat: templates BCU desde originales + variables completas en generate API
- Templates creados directamente desde los DOCX originales (misma fuente exacta)
- Reemplaza datos de ejemplo con {variables} manteniendo todo el formato original
- SDT checkboxes (actua_por, tipo_entidad) convertidos a placeholders dinámicos
- API ahora envía: actua_por_propia/tercero_check, tipo_doc, conyuge, PEP, mensajeria, usuario_web
- PJ: tipo_entidad_si/no_check dinámicos

Co-Authored-By: Claude Sonnet 4.6 <noreply@anthropic.com>
</commit_message>
<xml_diff>
--- a/public/bc-templates/cuestionario.docx
+++ b/public/bc-templates/cuestionario.docx
@@ -2072,7 +2072,7 @@
           </w:p>
           <w:p>
             <w:r>
-              <w:t>Puntaje obtenido: {puntaje}</w:t>
+              <w:t>Puntaje obtenido</w:t>
             </w:r>
           </w:p>
           <w:p>
@@ -2124,7 +2124,7 @@
               <w:rPr>
                 <w:b/>
               </w:rPr>
-              <w:t>Resultado del perfil: {resultado_perfil}</w:t>
+              <w:t>Resultado del perfil</w:t>
             </w:r>
           </w:p>
           <w:p>
@@ -2246,7 +2246,7 @@
               <w:rPr>
                 <w:b/>
               </w:rPr>
-              <w:t>Fecha: {fecha_firma}</w:t>
+              <w:t>Fecha:</w:t>
             </w:r>
           </w:p>
           <w:p/>

</xml_diff>

<commit_message>
fix: templates con placeholders completos + cuestionario con checkboxes por pregunta
- ficha-pf-geliene: clonado de ficha-pf-roble con branding GELIENE (24 placeholders)
- ficha-pj-roble: placeholders insertados en todos los campos vacíos (43 vars)
- ficha-pj-geliene: clonado de ficha-pj-roble con branding GELIENE (43 vars)
- cuestionario: placeholders para los 11 checkboxes de respuestas (q1-q11) + resumen
- buildCuestionarioVars: devuelve checkboxes por pregunta (q1a/q1b/q1c/q1d etc.)

Co-Authored-By: Claude Sonnet 4.6 <noreply@anthropic.com>
</commit_message>
<xml_diff>
--- a/public/bc-templates/cuestionario.docx
+++ b/public/bc-templates/cuestionario.docx
@@ -95,6 +95,12 @@
                 <w:b/>
               </w:rPr>
             </w:pPr>
+            <w:r>
+              <w:rPr>
+                <w:rFonts w:ascii="MS Gothic" w:hAnsi="MS Gothic"/>
+              </w:rPr>
+              <w:t>{q1a}</w:t>
+            </w:r>
           </w:p>
         </w:tc>
       </w:tr>
@@ -113,6 +119,12 @@
                 <w:b/>
               </w:rPr>
             </w:pPr>
+            <w:r>
+              <w:rPr>
+                <w:rFonts w:ascii="MS Gothic" w:hAnsi="MS Gothic"/>
+              </w:rPr>
+              <w:t>{q1b}</w:t>
+            </w:r>
           </w:p>
         </w:tc>
       </w:tr>
@@ -131,6 +143,12 @@
                 <w:b/>
               </w:rPr>
             </w:pPr>
+            <w:r>
+              <w:rPr>
+                <w:rFonts w:ascii="MS Gothic" w:hAnsi="MS Gothic"/>
+              </w:rPr>
+              <w:t>{q1c}</w:t>
+            </w:r>
           </w:p>
         </w:tc>
       </w:tr>
@@ -149,6 +167,12 @@
                 <w:b/>
               </w:rPr>
             </w:pPr>
+            <w:r>
+              <w:rPr>
+                <w:rFonts w:ascii="MS Gothic" w:hAnsi="MS Gothic"/>
+              </w:rPr>
+              <w:t>{q1d}</w:t>
+            </w:r>
           </w:p>
         </w:tc>
       </w:tr>
@@ -248,6 +272,12 @@
                 <w:b/>
               </w:rPr>
             </w:pPr>
+            <w:r>
+              <w:rPr>
+                <w:rFonts w:ascii="MS Gothic" w:hAnsi="MS Gothic"/>
+              </w:rPr>
+              <w:t>{q2a}</w:t>
+            </w:r>
           </w:p>
         </w:tc>
       </w:tr>
@@ -266,6 +296,12 @@
                 <w:b/>
               </w:rPr>
             </w:pPr>
+            <w:r>
+              <w:rPr>
+                <w:rFonts w:ascii="MS Gothic" w:hAnsi="MS Gothic"/>
+              </w:rPr>
+              <w:t>{q2b}</w:t>
+            </w:r>
           </w:p>
         </w:tc>
       </w:tr>
@@ -284,6 +320,12 @@
                 <w:b/>
               </w:rPr>
             </w:pPr>
+            <w:r>
+              <w:rPr>
+                <w:rFonts w:ascii="MS Gothic" w:hAnsi="MS Gothic"/>
+              </w:rPr>
+              <w:t>{q2c}</w:t>
+            </w:r>
           </w:p>
         </w:tc>
       </w:tr>
@@ -379,6 +421,12 @@
                 <w:b/>
               </w:rPr>
             </w:pPr>
+            <w:r>
+              <w:rPr>
+                <w:rFonts w:ascii="MS Gothic" w:hAnsi="MS Gothic"/>
+              </w:rPr>
+              <w:t>{q3a}</w:t>
+            </w:r>
           </w:p>
         </w:tc>
       </w:tr>
@@ -397,6 +445,12 @@
                 <w:b/>
               </w:rPr>
             </w:pPr>
+            <w:r>
+              <w:rPr>
+                <w:rFonts w:ascii="MS Gothic" w:hAnsi="MS Gothic"/>
+              </w:rPr>
+              <w:t>{q3b}</w:t>
+            </w:r>
           </w:p>
         </w:tc>
       </w:tr>
@@ -415,6 +469,12 @@
                 <w:b/>
               </w:rPr>
             </w:pPr>
+            <w:r>
+              <w:rPr>
+                <w:rFonts w:ascii="MS Gothic" w:hAnsi="MS Gothic"/>
+              </w:rPr>
+              <w:t>{q3c}</w:t>
+            </w:r>
           </w:p>
         </w:tc>
       </w:tr>
@@ -510,6 +570,12 @@
                 <w:b/>
               </w:rPr>
             </w:pPr>
+            <w:r>
+              <w:rPr>
+                <w:rFonts w:ascii="MS Gothic" w:hAnsi="MS Gothic"/>
+              </w:rPr>
+              <w:t>{q4a}</w:t>
+            </w:r>
           </w:p>
         </w:tc>
       </w:tr>
@@ -528,6 +594,12 @@
                 <w:b/>
               </w:rPr>
             </w:pPr>
+            <w:r>
+              <w:rPr>
+                <w:rFonts w:ascii="MS Gothic" w:hAnsi="MS Gothic"/>
+              </w:rPr>
+              <w:t>{q4b}</w:t>
+            </w:r>
           </w:p>
         </w:tc>
       </w:tr>
@@ -603,6 +675,12 @@
                 <w:b/>
               </w:rPr>
             </w:pPr>
+            <w:r>
+              <w:rPr>
+                <w:rFonts w:ascii="MS Gothic" w:hAnsi="MS Gothic"/>
+              </w:rPr>
+              <w:t>{q5a}</w:t>
+            </w:r>
           </w:p>
         </w:tc>
       </w:tr>
@@ -621,6 +699,12 @@
                 <w:b/>
               </w:rPr>
             </w:pPr>
+            <w:r>
+              <w:rPr>
+                <w:rFonts w:ascii="MS Gothic" w:hAnsi="MS Gothic"/>
+              </w:rPr>
+              <w:t>{q5b}</w:t>
+            </w:r>
           </w:p>
         </w:tc>
       </w:tr>
@@ -639,6 +723,12 @@
                 <w:b/>
               </w:rPr>
             </w:pPr>
+            <w:r>
+              <w:rPr>
+                <w:rFonts w:ascii="MS Gothic" w:hAnsi="MS Gothic"/>
+              </w:rPr>
+              <w:t>{q5c}</w:t>
+            </w:r>
           </w:p>
         </w:tc>
       </w:tr>
@@ -657,6 +747,12 @@
                 <w:b/>
               </w:rPr>
             </w:pPr>
+            <w:r>
+              <w:rPr>
+                <w:rFonts w:ascii="MS Gothic" w:hAnsi="MS Gothic"/>
+              </w:rPr>
+              <w:t>{q5d}</w:t>
+            </w:r>
           </w:p>
         </w:tc>
       </w:tr>
@@ -758,6 +854,12 @@
                 <w:b/>
               </w:rPr>
             </w:pPr>
+            <w:r>
+              <w:rPr>
+                <w:rFonts w:ascii="MS Gothic" w:hAnsi="MS Gothic"/>
+              </w:rPr>
+              <w:t>{q6a}</w:t>
+            </w:r>
           </w:p>
         </w:tc>
       </w:tr>
@@ -776,6 +878,12 @@
                 <w:b/>
               </w:rPr>
             </w:pPr>
+            <w:r>
+              <w:rPr>
+                <w:rFonts w:ascii="MS Gothic" w:hAnsi="MS Gothic"/>
+              </w:rPr>
+              <w:t>{q6b}</w:t>
+            </w:r>
           </w:p>
         </w:tc>
       </w:tr>
@@ -794,6 +902,12 @@
                 <w:b/>
               </w:rPr>
             </w:pPr>
+            <w:r>
+              <w:rPr>
+                <w:rFonts w:ascii="MS Gothic" w:hAnsi="MS Gothic"/>
+              </w:rPr>
+              <w:t>{q6c}</w:t>
+            </w:r>
           </w:p>
         </w:tc>
       </w:tr>
@@ -812,6 +926,12 @@
                 <w:b/>
               </w:rPr>
             </w:pPr>
+            <w:r>
+              <w:rPr>
+                <w:rFonts w:ascii="MS Gothic" w:hAnsi="MS Gothic"/>
+              </w:rPr>
+              <w:t>{q6d}</w:t>
+            </w:r>
           </w:p>
         </w:tc>
       </w:tr>
@@ -970,6 +1090,12 @@
                 <w:b/>
               </w:rPr>
             </w:pPr>
+            <w:r>
+              <w:rPr>
+                <w:rFonts w:ascii="MS Gothic" w:hAnsi="MS Gothic"/>
+              </w:rPr>
+              <w:t>{q7a}</w:t>
+            </w:r>
           </w:p>
         </w:tc>
       </w:tr>
@@ -1057,6 +1183,12 @@
                 <w:b/>
               </w:rPr>
             </w:pPr>
+            <w:r>
+              <w:rPr>
+                <w:rFonts w:ascii="MS Gothic" w:hAnsi="MS Gothic"/>
+              </w:rPr>
+              <w:t>{q7b}</w:t>
+            </w:r>
           </w:p>
         </w:tc>
       </w:tr>
@@ -1147,6 +1279,12 @@
                 <w:b/>
               </w:rPr>
             </w:pPr>
+            <w:r>
+              <w:rPr>
+                <w:rFonts w:ascii="MS Gothic" w:hAnsi="MS Gothic"/>
+              </w:rPr>
+              <w:t>{q7c}</w:t>
+            </w:r>
           </w:p>
         </w:tc>
       </w:tr>
@@ -1249,6 +1387,12 @@
                 <w:b/>
               </w:rPr>
             </w:pPr>
+            <w:r>
+              <w:rPr>
+                <w:rFonts w:ascii="MS Gothic" w:hAnsi="MS Gothic"/>
+              </w:rPr>
+              <w:t>{q7d}</w:t>
+            </w:r>
           </w:p>
         </w:tc>
       </w:tr>
@@ -1375,6 +1519,12 @@
                 <w:b/>
               </w:rPr>
             </w:pPr>
+            <w:r>
+              <w:rPr>
+                <w:rFonts w:ascii="MS Gothic" w:hAnsi="MS Gothic"/>
+              </w:rPr>
+              <w:t>{q8a}</w:t>
+            </w:r>
           </w:p>
         </w:tc>
       </w:tr>
@@ -1393,6 +1543,12 @@
                 <w:b/>
               </w:rPr>
             </w:pPr>
+            <w:r>
+              <w:rPr>
+                <w:rFonts w:ascii="MS Gothic" w:hAnsi="MS Gothic"/>
+              </w:rPr>
+              <w:t>{q8b}</w:t>
+            </w:r>
           </w:p>
         </w:tc>
       </w:tr>
@@ -1484,6 +1640,12 @@
                 <w:b/>
               </w:rPr>
             </w:pPr>
+            <w:r>
+              <w:rPr>
+                <w:rFonts w:ascii="MS Gothic" w:hAnsi="MS Gothic"/>
+              </w:rPr>
+              <w:t>{q8c}</w:t>
+            </w:r>
           </w:p>
         </w:tc>
       </w:tr>
@@ -1725,6 +1887,12 @@
                 <w:b/>
               </w:rPr>
             </w:pPr>
+            <w:r>
+              <w:rPr>
+                <w:rFonts w:ascii="MS Gothic" w:hAnsi="MS Gothic"/>
+              </w:rPr>
+              <w:t>{q10a}</w:t>
+            </w:r>
           </w:p>
         </w:tc>
       </w:tr>
@@ -1743,6 +1911,12 @@
                 <w:b/>
               </w:rPr>
             </w:pPr>
+            <w:r>
+              <w:rPr>
+                <w:rFonts w:ascii="MS Gothic" w:hAnsi="MS Gothic"/>
+              </w:rPr>
+              <w:t>{q10b}</w:t>
+            </w:r>
           </w:p>
         </w:tc>
       </w:tr>
@@ -1810,6 +1984,12 @@
                 <w:b/>
               </w:rPr>
             </w:pPr>
+            <w:r>
+              <w:rPr>
+                <w:rFonts w:ascii="MS Gothic" w:hAnsi="MS Gothic"/>
+              </w:rPr>
+              <w:t>{q10c}</w:t>
+            </w:r>
           </w:p>
         </w:tc>
       </w:tr>
@@ -1918,6 +2098,12 @@
                 <w:b/>
               </w:rPr>
             </w:pPr>
+            <w:r>
+              <w:rPr>
+                <w:rFonts w:ascii="MS Gothic" w:hAnsi="MS Gothic"/>
+              </w:rPr>
+              <w:t>{q11a}</w:t>
+            </w:r>
           </w:p>
         </w:tc>
       </w:tr>
@@ -1936,6 +2122,12 @@
                 <w:b/>
               </w:rPr>
             </w:pPr>
+            <w:r>
+              <w:rPr>
+                <w:rFonts w:ascii="MS Gothic" w:hAnsi="MS Gothic"/>
+              </w:rPr>
+              <w:t>{q11b}</w:t>
+            </w:r>
           </w:p>
         </w:tc>
       </w:tr>
@@ -1954,6 +2146,12 @@
                 <w:b/>
               </w:rPr>
             </w:pPr>
+            <w:r>
+              <w:rPr>
+                <w:rFonts w:ascii="MS Gothic" w:hAnsi="MS Gothic"/>
+              </w:rPr>
+              <w:t>{q11c}</w:t>
+            </w:r>
           </w:p>
         </w:tc>
       </w:tr>
@@ -1972,6 +2170,12 @@
                 <w:b/>
               </w:rPr>
             </w:pPr>
+            <w:r>
+              <w:rPr>
+                <w:rFonts w:ascii="MS Gothic" w:hAnsi="MS Gothic"/>
+              </w:rPr>
+              <w:t>{q11d}</w:t>
+            </w:r>
           </w:p>
         </w:tc>
       </w:tr>
@@ -2096,6 +2300,9 @@
                 <w:b/>
               </w:rPr>
             </w:pPr>
+            <w:r>
+              <w:t>{puntaje}</w:t>
+            </w:r>
           </w:p>
         </w:tc>
       </w:tr>
@@ -2149,6 +2356,9 @@
                 <w:color w:val="FFFFFF" w:themeColor="background1"/>
               </w:rPr>
             </w:pPr>
+            <w:r>
+              <w:t>{resultado_perfil}</w:t>
+            </w:r>
           </w:p>
         </w:tc>
       </w:tr>
@@ -2261,6 +2471,9 @@
                 <w:b/>
               </w:rPr>
             </w:pPr>
+            <w:r>
+              <w:t>{fecha_firma}</w:t>
+            </w:r>
           </w:p>
         </w:tc>
       </w:tr>

</xml_diff>